<commit_message>
Estrategia 5 de articulacion: elimina hackathones y retos en documento, figura 2 y PPT
</commit_message>
<xml_diff>
--- a/Estrategias-Articulacion-Facultades.docx
+++ b/Estrategias-Articulacion-Facultades.docx
@@ -1009,7 +1009,7 @@
         <w:pStyle w:val="Heading2"/>
       </w:pPr>
       <w:r>
-        <w:t>4.5 Estrategia 5: Actividades conjuntas: ferias, retos y hackathones</w:t>
+        <w:t>4.5 Estrategia 5: Actividades conjuntas: ferias y eventos de emprendimiento</w:t>
       </w:r>
     </w:p>
     <w:p>
@@ -1074,7 +1074,7 @@
         <w:rPr>
           <w:b w:val="0"/>
         </w:rPr>
-        <w:t>Retos y hackathones temáticos según el perfil de cada facultad.</w:t>
+        <w:t>Muestras de proyectos y conversatorios según el perfil de cada facultad.</w:t>
       </w:r>
     </w:p>
     <w:p>
@@ -1621,7 +1621,7 @@
               <w:rPr>
                 <w:sz w:val="19"/>
               </w:rPr>
-              <w:t>Ferias, retos y hackathones</w:t>
+              <w:t>Ferias y eventos de emprendimiento</w:t>
             </w:r>
           </w:p>
         </w:tc>

</xml_diff>

<commit_message>
Estrategias de articulacion: redaccion fluida, origen de datos de encuestas integrado al texto y alineacion (Linea 3, DOFA Anexo 4, red de mentores)
</commit_message>
<xml_diff>
--- a/Estrategias-Articulacion-Facultades.docx
+++ b/Estrategias-Articulacion-Facultades.docx
@@ -100,7 +100,7 @@
           <w:color w:val="595959"/>
           <w:sz w:val="22"/>
         </w:rPr>
-        <w:t>Documento anexo — Práctica Profesional (Opción de Grado)</w:t>
+        <w:t>Anexo 7 · Documento de la Práctica Profesional (Opción de Grado)</w:t>
       </w:r>
     </w:p>
     <w:p/>
@@ -199,7 +199,7 @@
           <w:b w:val="0"/>
           <w:i w:val="0"/>
         </w:rPr>
-        <w:t>Este documento desarrolla las estrategias de articulación entre el Centro de Innovación y Emprendimiento (CIE) y las facultades de la Universidad del Atlántico. La articulación se entiende como el conjunto de mecanismos que conectan de forma estable la oferta del CIE (ruta, servicios, ecosistema) con la vida académica de cada facultad (asignaturas, docentes, estudiantes y proyectos), de modo que el emprendimiento deje de ser una actividad periférica y se convierta en un componente transversal de la formación (Universidad del Atlántico, 2022).</w:t>
+        <w:t>Este documento desarrolla las estrategias de articulación entre el Centro de Innovación y Emprendimiento (CIE) y las facultades de la Universidad del Atlántico. Por articulación se entiende el conjunto de mecanismos que conectan de manera estable la oferta del CIE —su ruta, sus servicios y sus vínculos con el ecosistema— con la vida académica de cada facultad —las asignaturas, los docentes, los estudiantes y sus proyectos—, de modo que el emprendimiento deje de ser una actividad periférica y se convierta en un componente transversal de la formación, tal como lo concibe el Plan de Desarrollo Institucional 2022-2031 en su Línea Estratégica 3, «Impacto regional, nacional e internacional desde la Extensión y Proyección Social» (Universidad del Atlántico, 2022).</w:t>
       </w:r>
     </w:p>
     <w:p>
@@ -218,7 +218,7 @@
         <w:rPr>
           <w:b w:val="0"/>
         </w:rPr>
-        <w:t>Definir y explicar las estrategias que permitan fortalecer la articulación entre el CIE y las facultades, superando la principal debilidad detectada en el diagnóstico y asegurando que la ruta institucional de emprendimiento llegue de manera efectiva a toda la comunidad universitaria.</w:t>
+        <w:t>Definir y explicar las estrategias que permitan fortalecer la articulación entre el CIE y las facultades, con el fin de superar la principal debilidad detectada en el diagnóstico y asegurar que la ruta institucional de emprendimiento llegue de manera efectiva a toda la comunidad universitaria.</w:t>
       </w:r>
     </w:p>
     <w:p>
@@ -240,107 +240,7 @@
           <w:b w:val="0"/>
           <w:i w:val="0"/>
         </w:rPr>
-        <w:t>Las estrategias no parten de un supuesto, sino de un diagnóstico respaldado por tres fuentes que coinciden: la encuesta a docentes (n = 10), la encuesta a estudiantes y egresados (n = 106) y las consultas a actores del ecosistema. Los hallazgos que justifican la articulación son:</w:t>
-      </w:r>
-    </w:p>
-    <w:p>
-      <w:pPr>
-        <w:pStyle w:val="ListBullet"/>
-        <w:spacing w:after="60"/>
-        <w:ind w:left="454"/>
-        <w:jc w:val="both"/>
-      </w:pPr>
-      <w:r>
-        <w:rPr>
-          <w:b w:val="0"/>
-        </w:rPr>
-      </w:r>
-      <w:r>
-        <w:rPr>
-          <w:b/>
-        </w:rPr>
-        <w:t>La articulación es la dificultad número uno.</w:t>
-      </w:r>
-      <w:r>
-        <w:rPr>
-          <w:b w:val="0"/>
-        </w:rPr>
-        <w:t xml:space="preserve"> El 60 % de los docentes señaló la falta de articulación entre las facultades y el CIE como la principal dificultad para fortalecer el emprendimiento, y la afirmación «existe articulación entre las facultades y el CIE» obtuvo apenas 3,2/5.</w:t>
-      </w:r>
-    </w:p>
-    <w:p>
-      <w:pPr>
-        <w:pStyle w:val="ListBullet"/>
-        <w:spacing w:after="60"/>
-        <w:ind w:left="454"/>
-        <w:jc w:val="both"/>
-      </w:pPr>
-      <w:r>
-        <w:rPr>
-          <w:b w:val="0"/>
-        </w:rPr>
-      </w:r>
-      <w:r>
-        <w:rPr>
-          <w:b/>
-        </w:rPr>
-        <w:t>El emprendimiento aún no es transversal.</w:t>
-      </w:r>
-      <w:r>
-        <w:rPr>
-          <w:b w:val="0"/>
-        </w:rPr>
-        <w:t xml:space="preserve"> La integración del emprendimiento en el currículo fue valorada en 3,30/5, pese a que el 87,7 % de los estudiantes manifiesta interés en emprender. Existe demanda, pero la formación no la acompaña de forma transversal.</w:t>
-      </w:r>
-    </w:p>
-    <w:p>
-      <w:pPr>
-        <w:pStyle w:val="ListBullet"/>
-        <w:spacing w:after="60"/>
-        <w:ind w:left="454"/>
-        <w:jc w:val="both"/>
-      </w:pPr>
-      <w:r>
-        <w:rPr>
-          <w:b w:val="0"/>
-        </w:rPr>
-      </w:r>
-      <w:r>
-        <w:rPr>
-          <w:b/>
-        </w:rPr>
-        <w:t>Baja visibilidad del CIE.</w:t>
-      </w:r>
-      <w:r>
-        <w:rPr>
-          <w:b w:val="0"/>
-        </w:rPr>
-        <w:t xml:space="preserve"> El 67 % de los estudiantes conoce poco o nada el Centro, lo que confirma que la oferta no está llegando a las facultades.</w:t>
-      </w:r>
-    </w:p>
-    <w:p>
-      <w:pPr>
-        <w:pStyle w:val="ListBullet"/>
-        <w:spacing w:after="60"/>
-        <w:ind w:left="454"/>
-        <w:jc w:val="both"/>
-      </w:pPr>
-      <w:r>
-        <w:rPr>
-          <w:b w:val="0"/>
-        </w:rPr>
-      </w:r>
-      <w:r>
-        <w:rPr>
-          <w:b/>
-        </w:rPr>
-        <w:t>Respaldo docente a la solución.</w:t>
-      </w:r>
-      <w:r>
-        <w:rPr>
-          <w:b w:val="0"/>
-        </w:rPr>
-        <w:t xml:space="preserve"> La afirmación mejor valorada por los docentes (4,2/5) fue que una ruta institucional fortalecería el ecosistema. Los docentes reconocen el problema y avalan la solución.</w:t>
+        <w:t>Las estrategias que se presentan en este documento no parten de un supuesto, sino de un diagnóstico construido a partir de tres fuentes que apuntan en la misma dirección: una encuesta aplicada a estudiantes y egresados (106 respuestas), una encuesta aplicada a docentes (10 respuestas) y las consultas realizadas a actores del ecosistema. Del contraste de estas fuentes se desprenden cuatro hallazgos que hacen necesaria la articulación.</w:t>
       </w:r>
     </w:p>
     <w:p>
@@ -353,7 +253,46 @@
           <w:b w:val="0"/>
           <w:i w:val="0"/>
         </w:rPr>
-        <w:t>En síntesis, articular no es opcional: es la condición para que la ruta institucional funcione. Las secciones siguientes definen el modelo de articulación y las estrategias concretas que lo hacen posible.</w:t>
+        <w:t>En primer lugar, la articulación es la principal dificultad del ecosistema. Cuando se preguntó a los docentes por el mayor obstáculo para fortalecer el emprendimiento, seis de los diez encuestados —el 60 %— señalaron precisamente la falta de articulación entre las facultades y el CIE; en coherencia, la afirmación de que ya existe esa articulación apenas obtuvo un promedio de 3,2 sobre 5 en la misma encuesta.</w:t>
+      </w:r>
+    </w:p>
+    <w:p>
+      <w:pPr>
+        <w:spacing w:after="120"/>
+        <w:jc w:val="both"/>
+      </w:pPr>
+      <w:r>
+        <w:rPr>
+          <w:b w:val="0"/>
+          <w:i w:val="0"/>
+        </w:rPr>
+        <w:t>En segundo lugar, el emprendimiento todavía no permea la formación de manera transversal. Aunque la encuesta a estudiantes reveló que el 87,7 % manifiesta algún grado de interés o actividad emprendedora, la integración del emprendimiento en el currículo fue valorada en apenas 3,30 sobre 5, lo que evidencia que la oferta formativa no acompaña ese interés.</w:t>
+      </w:r>
+    </w:p>
+    <w:p>
+      <w:pPr>
+        <w:spacing w:after="120"/>
+        <w:jc w:val="both"/>
+      </w:pPr>
+      <w:r>
+        <w:rPr>
+          <w:b w:val="0"/>
+          <w:i w:val="0"/>
+        </w:rPr>
+        <w:t>En tercer lugar, la oferta del CIE no está llegando a las facultades: el 67 % de los estudiantes encuestados declaró conocer poco o nada el Centro, una brecha de visibilidad que limita el alcance de cualquier iniciativa. Y en cuarto lugar, los propios docentes avalan la solución, pues la afirmación mejor valorada de su encuesta —con 4,2 sobre 5— fue que la creación de una ruta institucional fortalecería el ecosistema emprendedor.</w:t>
+      </w:r>
+    </w:p>
+    <w:p>
+      <w:pPr>
+        <w:spacing w:after="120"/>
+        <w:jc w:val="both"/>
+      </w:pPr>
+      <w:r>
+        <w:rPr>
+          <w:b w:val="0"/>
+          <w:i w:val="0"/>
+        </w:rPr>
+        <w:t>En síntesis, articular no es una opción, sino la condición para que la ruta institucional funcione. Las secciones siguientes presentan el modelo de articulación y las seis estrategias concretas que lo hacen posible.</w:t>
       </w:r>
     </w:p>
     <w:p>
@@ -519,16 +458,10 @@
       </w:pPr>
       <w:r>
         <w:rPr>
-          <w:b/>
-          <w:color w:val="1E3B7D"/>
+          <w:b w:val="0"/>
+          <w:i w:val="0"/>
         </w:rPr>
-        <w:t xml:space="preserve">¿Qué es? </w:t>
-      </w:r>
-      <w:r>
-        <w:rPr>
-          <w:b w:val="0"/>
-        </w:rPr>
-        <w:t>Un profesor designado formalmente en cada facultad como punto de contacto entre el CIE y su comunidad. Es la pieza clave del modelo, pues traduce la oferta del Centro al lenguaje y las necesidades de cada disciplina.</w:t>
+        <w:t>El docente enlace es un profesor designado formalmente en cada facultad como punto de contacto entre el CIE y su comunidad; constituye la pieza clave del modelo, pues traduce la oferta del Centro al lenguaje y a las necesidades propias de cada disciplina. Su implementación supone designarlo de manera oficial —con sus funciones incluidas en el plan de trabajo—, encomendarle la difusión de la ruta y de las convocatorias, la identificación de proyectos y estudiantes con potencial y su canalización hacia el CIE, además de representar a la facultad en la mesa de articulación; para ello, el Centro le brinda una inducción inicial.</w:t>
       </w:r>
     </w:p>
     <w:p>
@@ -538,95 +471,10 @@
       </w:pPr>
       <w:r>
         <w:rPr>
-          <w:b/>
-          <w:color w:val="1E3B7D"/>
+          <w:b w:val="0"/>
+          <w:i w:val="0"/>
         </w:rPr>
-        <w:t xml:space="preserve">¿Cómo se implementa? </w:t>
-      </w:r>
-      <w:r>
-        <w:rPr>
-          <w:b w:val="0"/>
-        </w:rPr>
-      </w:r>
-    </w:p>
-    <w:p>
-      <w:pPr>
-        <w:pStyle w:val="ListBullet"/>
-        <w:spacing w:after="60"/>
-        <w:ind w:left="454"/>
-        <w:jc w:val="both"/>
-      </w:pPr>
-      <w:r>
-        <w:rPr>
-          <w:b w:val="0"/>
-        </w:rPr>
-        <w:t>Designación formal de un docente enlace por facultad, con funciones incluidas en su plan de trabajo.</w:t>
-      </w:r>
-    </w:p>
-    <w:p>
-      <w:pPr>
-        <w:pStyle w:val="ListBullet"/>
-        <w:spacing w:after="60"/>
-        <w:ind w:left="454"/>
-        <w:jc w:val="both"/>
-      </w:pPr>
-      <w:r>
-        <w:rPr>
-          <w:b w:val="0"/>
-        </w:rPr>
-        <w:t>Funciones: difundir la ruta y las convocatorias, identificar proyectos y estudiantes con potencial, canalizarlos hacia el CIE y representar a la facultad en la mesa de articulación.</w:t>
-      </w:r>
-    </w:p>
-    <w:p>
-      <w:pPr>
-        <w:pStyle w:val="ListBullet"/>
-        <w:spacing w:after="60"/>
-        <w:ind w:left="454"/>
-        <w:jc w:val="both"/>
-      </w:pPr>
-      <w:r>
-        <w:rPr>
-          <w:b w:val="0"/>
-        </w:rPr>
-        <w:t>Inducción inicial del docente enlace por parte del CIE.</w:t>
-      </w:r>
-    </w:p>
-    <w:p>
-      <w:pPr>
-        <w:spacing w:after="120"/>
-        <w:jc w:val="both"/>
-      </w:pPr>
-      <w:r>
-        <w:rPr>
-          <w:b/>
-          <w:color w:val="1E3B7D"/>
-        </w:rPr>
-        <w:t xml:space="preserve">Evidencia que la respalda. </w:t>
-      </w:r>
-      <w:r>
-        <w:rPr>
-          <w:b w:val="0"/>
-        </w:rPr>
-        <w:t>Los docentes solicitaron expresamente «reuniones con profesores expertos» y espacios de coordinación (pregunta abierta P8), y la estrategia DO del análisis DOFA plantea el docente enlace como mecanismo para superar la débil articulación (3,2/5).</w:t>
-      </w:r>
-    </w:p>
-    <w:p>
-      <w:pPr>
-        <w:spacing w:after="120"/>
-        <w:jc w:val="both"/>
-      </w:pPr>
-      <w:r>
-        <w:rPr>
-          <w:b/>
-          <w:color w:val="1E3B7D"/>
-        </w:rPr>
-        <w:t xml:space="preserve">Indicador de seguimiento. </w:t>
-      </w:r>
-      <w:r>
-        <w:rPr>
-          <w:b w:val="0"/>
-        </w:rPr>
-        <w:t>Número de facultades con docente enlace activo (meta: todas las facultades) y número de proyectos canalizados por cada enlace.</w:t>
+        <w:t>Esta estrategia responde a una necesidad expresada por los propios docentes: en las respuestas abiertas de la encuesta aplicada a los diez profesores, varios pidieron reuniones con profesores expertos y espacios permanentes de coordinación. En esa misma línea, el análisis DOFA (Anexo 4) plantea la figura del docente enlace, dentro de sus estrategias de reorientación, como el mecanismo para superar la débil articulación —valorada en apenas 3,2 sobre 5 en la encuesta docente—. Su avance se medirá por el número de facultades con docente enlace activo, con la meta de cubrirlas todas, y por la cantidad de proyectos canalizados por cada enlace.</w:t>
       </w:r>
     </w:p>
     <w:p>
@@ -644,16 +492,10 @@
       </w:pPr>
       <w:r>
         <w:rPr>
-          <w:b/>
-          <w:color w:val="2E7D32"/>
+          <w:b w:val="0"/>
+          <w:i w:val="0"/>
         </w:rPr>
-        <w:t xml:space="preserve">¿Qué es? </w:t>
-      </w:r>
-      <w:r>
-        <w:rPr>
-          <w:b w:val="0"/>
-        </w:rPr>
-        <w:t>Incorporar el emprendimiento de forma gradual en la vida académica: en asignaturas, electivas, opciones de grado y semilleros, para que la formación acompañe el interés de los estudiantes.</w:t>
+        <w:t>Esta estrategia busca incorporar el emprendimiento de forma gradual en la vida académica —en asignaturas, electivas, opciones de grado y semilleros—, de manera que la formación acompañe el interés que ya manifiestan los estudiantes. En la práctica, implica mapear en cada programa las asignaturas donde el emprendimiento pueda integrarse como contenido o proyecto, ofrecer una cátedra o módulo transversal disponible para toda la Universidad y fortalecer tanto la opción de grado en emprendimiento como los semilleros vinculados al CIE.</w:t>
       </w:r>
     </w:p>
     <w:p>
@@ -663,95 +505,10 @@
       </w:pPr>
       <w:r>
         <w:rPr>
-          <w:b/>
-          <w:color w:val="2E7D32"/>
+          <w:b w:val="0"/>
+          <w:i w:val="0"/>
         </w:rPr>
-        <w:t xml:space="preserve">¿Cómo se implementa? </w:t>
-      </w:r>
-      <w:r>
-        <w:rPr>
-          <w:b w:val="0"/>
-        </w:rPr>
-      </w:r>
-    </w:p>
-    <w:p>
-      <w:pPr>
-        <w:pStyle w:val="ListBullet"/>
-        <w:spacing w:after="60"/>
-        <w:ind w:left="454"/>
-        <w:jc w:val="both"/>
-      </w:pPr>
-      <w:r>
-        <w:rPr>
-          <w:b w:val="0"/>
-        </w:rPr>
-        <w:t>Mapeo de asignaturas por programa donde el emprendimiento pueda incorporarse como contenido o proyecto.</w:t>
-      </w:r>
-    </w:p>
-    <w:p>
-      <w:pPr>
-        <w:pStyle w:val="ListBullet"/>
-        <w:spacing w:after="60"/>
-        <w:ind w:left="454"/>
-        <w:jc w:val="both"/>
-      </w:pPr>
-      <w:r>
-        <w:rPr>
-          <w:b w:val="0"/>
-        </w:rPr>
-        <w:t>Cátedra o módulo transversal de emprendimiento disponible para todos los programas.</w:t>
-      </w:r>
-    </w:p>
-    <w:p>
-      <w:pPr>
-        <w:pStyle w:val="ListBullet"/>
-        <w:spacing w:after="60"/>
-        <w:ind w:left="454"/>
-        <w:jc w:val="both"/>
-      </w:pPr>
-      <w:r>
-        <w:rPr>
-          <w:b w:val="0"/>
-        </w:rPr>
-        <w:t>Fortalecimiento de la opción de grado en emprendimiento (caso de empresa) y de los semilleros vinculados al CIE.</w:t>
-      </w:r>
-    </w:p>
-    <w:p>
-      <w:pPr>
-        <w:spacing w:after="120"/>
-        <w:jc w:val="both"/>
-      </w:pPr>
-      <w:r>
-        <w:rPr>
-          <w:b/>
-          <w:color w:val="2E7D32"/>
-        </w:rPr>
-        <w:t xml:space="preserve">Evidencia que la respalda. </w:t>
-      </w:r>
-      <w:r>
-        <w:rPr>
-          <w:b w:val="0"/>
-        </w:rPr>
-        <w:t>Integrar el emprendimiento en las asignaturas fue la estrategia más priorizada por los docentes (6 de 10 menciones, P6), coherente con el respaldo a un emprendimiento transversal (3,8/5) y con la baja integración curricular actual (3,30/5). El emprendimiento debe fortalecerse de manera transversal en todos los programas (Universidad del Atlántico, 2022).</w:t>
-      </w:r>
-    </w:p>
-    <w:p>
-      <w:pPr>
-        <w:spacing w:after="120"/>
-        <w:jc w:val="both"/>
-      </w:pPr>
-      <w:r>
-        <w:rPr>
-          <w:b/>
-          <w:color w:val="2E7D32"/>
-        </w:rPr>
-        <w:t xml:space="preserve">Indicador de seguimiento. </w:t>
-      </w:r>
-      <w:r>
-        <w:rPr>
-          <w:b w:val="0"/>
-        </w:rPr>
-        <w:t>Número de programas con contenidos de emprendimiento y número de opciones de grado o semilleros en emprendimiento activos.</w:t>
+        <w:t>Su respaldo proviene directamente de la encuesta a docentes: al consultarles por las estrategias prioritarias, integrar el emprendimiento en las asignaturas fue la más elegida, con seis de las diez respuestas, en coherencia con el alto acuerdo en que el emprendimiento debe fortalecerse de manera transversal (3,8 sobre 5) y con la baja valoración de su integración curricular actual (3,30 sobre 5). Esta orientación coincide, además, con el mandato del PDI 2022-2031 de fomentar la cultura de innovación y emprendimiento en toda la comunidad (Universidad del Atlántico, 2022). El indicador de seguimiento será el número de programas con contenidos de emprendimiento y la cantidad de opciones de grado y semilleros activos en la materia.</w:t>
       </w:r>
     </w:p>
     <w:p>
@@ -769,16 +526,10 @@
       </w:pPr>
       <w:r>
         <w:rPr>
-          <w:b/>
-          <w:color w:val="E47331"/>
+          <w:b w:val="0"/>
+          <w:i w:val="0"/>
         </w:rPr>
-        <w:t xml:space="preserve">¿Qué es? </w:t>
-      </w:r>
-      <w:r>
-        <w:rPr>
-          <w:b w:val="0"/>
-        </w:rPr>
-        <w:t>Una instancia formal de coordinación, con representantes del CIE y de las facultades (los docentes enlace), encargada de planear, hacer seguimiento y sostener la articulación en el tiempo.</w:t>
+        <w:t>La mesa de articulación es una instancia formal de coordinación, integrada por representantes del CIE y de las facultades —los docentes enlace—, encargada de planear la articulación, hacer seguimiento y sostenerla en el tiempo. Su funcionamiento se apoya en reuniones periódicas con agenda, actas y metas, y en un plan operativo anual alineado con el PDI 2022-2031.</w:t>
       </w:r>
     </w:p>
     <w:p>
@@ -788,95 +539,10 @@
       </w:pPr>
       <w:r>
         <w:rPr>
-          <w:b/>
-          <w:color w:val="E47331"/>
+          <w:b w:val="0"/>
+          <w:i w:val="0"/>
         </w:rPr>
-        <w:t xml:space="preserve">¿Cómo se implementa? </w:t>
-      </w:r>
-      <w:r>
-        <w:rPr>
-          <w:b w:val="0"/>
-        </w:rPr>
-      </w:r>
-    </w:p>
-    <w:p>
-      <w:pPr>
-        <w:pStyle w:val="ListBullet"/>
-        <w:spacing w:after="60"/>
-        <w:ind w:left="454"/>
-        <w:jc w:val="both"/>
-      </w:pPr>
-      <w:r>
-        <w:rPr>
-          <w:b w:val="0"/>
-        </w:rPr>
-        <w:t>Conformación de la mesa con el CIE y un representante por facultad.</w:t>
-      </w:r>
-    </w:p>
-    <w:p>
-      <w:pPr>
-        <w:pStyle w:val="ListBullet"/>
-        <w:spacing w:after="60"/>
-        <w:ind w:left="454"/>
-        <w:jc w:val="both"/>
-      </w:pPr>
-      <w:r>
-        <w:rPr>
-          <w:b w:val="0"/>
-        </w:rPr>
-        <w:t>Reuniones periódicas con agenda, actas y metas de articulación.</w:t>
-      </w:r>
-    </w:p>
-    <w:p>
-      <w:pPr>
-        <w:pStyle w:val="ListBullet"/>
-        <w:spacing w:after="60"/>
-        <w:ind w:left="454"/>
-        <w:jc w:val="both"/>
-      </w:pPr>
-      <w:r>
-        <w:rPr>
-          <w:b w:val="0"/>
-        </w:rPr>
-        <w:t>Plan operativo anual alineado con el PDI 2022-2031.</w:t>
-      </w:r>
-    </w:p>
-    <w:p>
-      <w:pPr>
-        <w:spacing w:after="120"/>
-        <w:jc w:val="both"/>
-      </w:pPr>
-      <w:r>
-        <w:rPr>
-          <w:b/>
-          <w:color w:val="E47331"/>
-        </w:rPr>
-        <w:t xml:space="preserve">Evidencia que la respalda. </w:t>
-      </w:r>
-      <w:r>
-        <w:rPr>
-          <w:b w:val="0"/>
-        </w:rPr>
-        <w:t>Los docentes pidieron «reuniones proyectadas» y espacios de coordinación (P8). La gobernanza formaliza la articulación y evita que dependa de esfuerzos individuales, atendiendo la estrategia FA del DOFA de usar el respaldo del PDI para asegurar continuidad (Universidad del Atlántico, 2022).</w:t>
-      </w:r>
-    </w:p>
-    <w:p>
-      <w:pPr>
-        <w:spacing w:after="120"/>
-        <w:jc w:val="both"/>
-      </w:pPr>
-      <w:r>
-        <w:rPr>
-          <w:b/>
-          <w:color w:val="E47331"/>
-        </w:rPr>
-        <w:t xml:space="preserve">Indicador de seguimiento. </w:t>
-      </w:r>
-      <w:r>
-        <w:rPr>
-          <w:b w:val="0"/>
-        </w:rPr>
-        <w:t>Número de reuniones realizadas por período y porcentaje de cumplimiento de las metas de articulación.</w:t>
+        <w:t>La necesidad de esta instancia también surgió de la encuesta docente, en la que se pidieron reuniones proyectadas y espacios estables de coordinación. Al formalizar la articulación, la mesa evita que esta dependa de esfuerzos individuales y da continuidad a los procesos, en línea con la estrategia defensiva del análisis DOFA (Anexo 4) de aprovechar el respaldo del PDI para asegurar recursos y sostenibilidad. Se hará seguimiento mediante el número de reuniones realizadas por período y el porcentaje de cumplimiento de las metas de articulación.</w:t>
       </w:r>
     </w:p>
     <w:p>
@@ -894,16 +560,10 @@
       </w:pPr>
       <w:r>
         <w:rPr>
-          <w:b/>
-          <w:color w:val="595959"/>
+          <w:b w:val="0"/>
+          <w:i w:val="0"/>
         </w:rPr>
-        <w:t xml:space="preserve">¿Qué es? </w:t>
-      </w:r>
-      <w:r>
-        <w:rPr>
-          <w:b w:val="0"/>
-        </w:rPr>
-        <w:t>Una estrategia de comunicación segmentada según el público, para elevar la visibilidad del CIE —hoy su principal debilidad— y garantizar que la información llegue a docentes y estudiantes.</w:t>
+        <w:t>Esta estrategia consiste en una comunicación segmentada según el público, orientada a elevar la visibilidad del CIE —hoy su principal debilidad— y a garantizar que la información llegue efectivamente a docentes y estudiantes. Para ello se emplea el correo institucional como canal principal hacia los docentes y WhatsApp y las redes sociales hacia los estudiantes, acompañados de un boletín periódico del CIE y de un calendario de convocatorias difundido por los docentes enlace.</w:t>
       </w:r>
     </w:p>
     <w:p>
@@ -913,95 +573,10 @@
       </w:pPr>
       <w:r>
         <w:rPr>
-          <w:b/>
-          <w:color w:val="595959"/>
+          <w:b w:val="0"/>
+          <w:i w:val="0"/>
         </w:rPr>
-        <w:t xml:space="preserve">¿Cómo se implementa? </w:t>
-      </w:r>
-      <w:r>
-        <w:rPr>
-          <w:b w:val="0"/>
-        </w:rPr>
-      </w:r>
-    </w:p>
-    <w:p>
-      <w:pPr>
-        <w:pStyle w:val="ListBullet"/>
-        <w:spacing w:after="60"/>
-        <w:ind w:left="454"/>
-        <w:jc w:val="both"/>
-      </w:pPr>
-      <w:r>
-        <w:rPr>
-          <w:b w:val="0"/>
-        </w:rPr>
-        <w:t>Uso del correo institucional como canal principal hacia los docentes (medio preferido: 6 de 10).</w:t>
-      </w:r>
-    </w:p>
-    <w:p>
-      <w:pPr>
-        <w:pStyle w:val="ListBullet"/>
-        <w:spacing w:after="60"/>
-        <w:ind w:left="454"/>
-        <w:jc w:val="both"/>
-      </w:pPr>
-      <w:r>
-        <w:rPr>
-          <w:b w:val="0"/>
-        </w:rPr>
-        <w:t>Uso de WhatsApp y redes sociales hacia los estudiantes (canales preferidos por el 82 %).</w:t>
-      </w:r>
-    </w:p>
-    <w:p>
-      <w:pPr>
-        <w:pStyle w:val="ListBullet"/>
-        <w:spacing w:after="60"/>
-        <w:ind w:left="454"/>
-        <w:jc w:val="both"/>
-      </w:pPr>
-      <w:r>
-        <w:rPr>
-          <w:b w:val="0"/>
-        </w:rPr>
-        <w:t>Boletín periódico del CIE y calendario de convocatorias difundido por los docentes enlace.</w:t>
-      </w:r>
-    </w:p>
-    <w:p>
-      <w:pPr>
-        <w:spacing w:after="120"/>
-        <w:jc w:val="both"/>
-      </w:pPr>
-      <w:r>
-        <w:rPr>
-          <w:b/>
-          <w:color w:val="595959"/>
-        </w:rPr>
-        <w:t xml:space="preserve">Evidencia que la respalda. </w:t>
-      </w:r>
-      <w:r>
-        <w:rPr>
-          <w:b w:val="0"/>
-        </w:rPr>
-        <w:t>La falta de difusión fue señalada por el 50 % de los docentes (P5) y el 67 % de los estudiantes conoce poco o nada el CIE; además, la principal razón para no acercarse es el desconocimiento de los servicios (54,7 %). La estrategia DO del DOFA prioriza la difusión para elevar la visibilidad.</w:t>
-      </w:r>
-    </w:p>
-    <w:p>
-      <w:pPr>
-        <w:spacing w:after="120"/>
-        <w:jc w:val="both"/>
-      </w:pPr>
-      <w:r>
-        <w:rPr>
-          <w:b/>
-          <w:color w:val="595959"/>
-        </w:rPr>
-        <w:t xml:space="preserve">Indicador de seguimiento. </w:t>
-      </w:r>
-      <w:r>
-        <w:rPr>
-          <w:b w:val="0"/>
-        </w:rPr>
-        <w:t>Alcance de las comunicaciones (aperturas, vistas) y porcentaje de la comunidad que declara conocer el CIE y su ruta.</w:t>
+        <w:t>La pertinencia de diferenciar los canales se sustenta en los datos de las encuestas: la mitad de los docentes señaló la falta de difusión como una de las principales dificultades, mientras que entre los estudiantes el 67 % conoce poco o nada el Centro y el 54,7 % no se ha acercado precisamente por desconocer sus servicios. La elección de los canales tampoco es arbitraria, pues el correo institucional es el medio preferido por los docentes —seis de diez— y, junto con WhatsApp, concentra el 82 % de la preferencia de los estudiantes. Así, esta estrategia materializa la línea de reorientación del DOFA (Anexo 4), que prioriza la difusión para elevar la visibilidad. Su avance se medirá por el alcance de las comunicaciones y por el porcentaje de la comunidad que declara conocer el CIE y su ruta.</w:t>
       </w:r>
     </w:p>
     <w:p>
@@ -1019,16 +594,10 @@
       </w:pPr>
       <w:r>
         <w:rPr>
-          <w:b/>
-          <w:color w:val="2E7D32"/>
+          <w:b w:val="0"/>
+          <w:i w:val="0"/>
         </w:rPr>
-        <w:t xml:space="preserve">¿Qué es? </w:t>
-      </w:r>
-      <w:r>
-        <w:rPr>
-          <w:b w:val="0"/>
-        </w:rPr>
-        <w:t>Eventos co-organizados entre el CIE y cada facultad que acercan el emprendimiento a los estudiantes en su propio contexto disciplinar y generan proyectos.</w:t>
+        <w:t>Esta estrategia propone eventos co-organizados entre el CIE y cada facultad que acercan el emprendimiento a los estudiantes en su propio contexto disciplinar y, al mismo tiempo, generan proyectos. Se concreta en un calendario anual de ferias y eventos por facultad, en muestras de proyectos y conversatorios ajustados al perfil de cada una, y en la vinculación de mentores y aliados del ecosistema a dichas actividades.</w:t>
       </w:r>
     </w:p>
     <w:p>
@@ -1038,95 +607,10 @@
       </w:pPr>
       <w:r>
         <w:rPr>
-          <w:b/>
-          <w:color w:val="2E7D32"/>
+          <w:b w:val="0"/>
+          <w:i w:val="0"/>
         </w:rPr>
-        <w:t xml:space="preserve">¿Cómo se implementa? </w:t>
-      </w:r>
-      <w:r>
-        <w:rPr>
-          <w:b w:val="0"/>
-        </w:rPr>
-      </w:r>
-    </w:p>
-    <w:p>
-      <w:pPr>
-        <w:pStyle w:val="ListBullet"/>
-        <w:spacing w:after="60"/>
-        <w:ind w:left="454"/>
-        <w:jc w:val="both"/>
-      </w:pPr>
-      <w:r>
-        <w:rPr>
-          <w:b w:val="0"/>
-        </w:rPr>
-        <w:t>Calendario anual de ferias y eventos de emprendimiento por facultad.</w:t>
-      </w:r>
-    </w:p>
-    <w:p>
-      <w:pPr>
-        <w:pStyle w:val="ListBullet"/>
-        <w:spacing w:after="60"/>
-        <w:ind w:left="454"/>
-        <w:jc w:val="both"/>
-      </w:pPr>
-      <w:r>
-        <w:rPr>
-          <w:b w:val="0"/>
-        </w:rPr>
-        <w:t>Muestras de proyectos y conversatorios según el perfil de cada facultad.</w:t>
-      </w:r>
-    </w:p>
-    <w:p>
-      <w:pPr>
-        <w:pStyle w:val="ListBullet"/>
-        <w:spacing w:after="60"/>
-        <w:ind w:left="454"/>
-        <w:jc w:val="both"/>
-      </w:pPr>
-      <w:r>
-        <w:rPr>
-          <w:b w:val="0"/>
-        </w:rPr>
-        <w:t>Vinculación de mentores y aliados del ecosistema a estas actividades.</w:t>
-      </w:r>
-    </w:p>
-    <w:p>
-      <w:pPr>
-        <w:spacing w:after="120"/>
-        <w:jc w:val="both"/>
-      </w:pPr>
-      <w:r>
-        <w:rPr>
-          <w:b/>
-          <w:color w:val="2E7D32"/>
-        </w:rPr>
-        <w:t xml:space="preserve">Evidencia que la respalda. </w:t>
-      </w:r>
-      <w:r>
-        <w:rPr>
-          <w:b w:val="0"/>
-        </w:rPr>
-        <w:t>Las ferias y eventos de emprendimiento fueron priorizados por 5 de 10 docentes (P6). Este tipo de actividades aprovecha el alto interés estudiantil (87,7 %) y ayuda a sostener la participación (estrategia FA del DOFA).</w:t>
-      </w:r>
-    </w:p>
-    <w:p>
-      <w:pPr>
-        <w:spacing w:after="120"/>
-        <w:jc w:val="both"/>
-      </w:pPr>
-      <w:r>
-        <w:rPr>
-          <w:b/>
-          <w:color w:val="2E7D32"/>
-        </w:rPr>
-        <w:t xml:space="preserve">Indicador de seguimiento. </w:t>
-      </w:r>
-      <w:r>
-        <w:rPr>
-          <w:b w:val="0"/>
-        </w:rPr>
-        <w:t>Número de eventos realizados por facultad y número de participantes y proyectos surgidos de ellos.</w:t>
+        <w:t>Las ferias y los eventos de emprendimiento figuraron entre las estrategias más valoradas por los docentes, con cinco de las diez menciones. Este tipo de actividades aprovecha el alto interés estudiantil —el 87,7 % manifiesta algún grado de interés o actividad emprendedora— y contribuye a sostener la participación en el tiempo, en sintonía con la estrategia defensiva del DOFA (Anexo 4). El seguimiento se hará por el número de eventos realizados por facultad y por la cantidad de participantes y de proyectos surgidos de ellos.</w:t>
       </w:r>
     </w:p>
     <w:p>
@@ -1144,114 +628,10 @@
       </w:pPr>
       <w:r>
         <w:rPr>
-          <w:b/>
-          <w:color w:val="1E3B7D"/>
+          <w:b w:val="0"/>
+          <w:i w:val="0"/>
         </w:rPr>
-        <w:t xml:space="preserve">¿Qué es? </w:t>
-      </w:r>
-      <w:r>
-        <w:rPr>
-          <w:b w:val="0"/>
-        </w:rPr>
-        <w:t>Capacitar a los docentes en innovación y emprendimiento y activar una red de mentores multidisciplinarios que asesoren los proyectos según su área, para que el acompañamiento tenga la profundidad que cada iniciativa requiere.</w:t>
-      </w:r>
-    </w:p>
-    <w:p>
-      <w:pPr>
-        <w:spacing w:after="120"/>
-        <w:jc w:val="both"/>
-      </w:pPr>
-      <w:r>
-        <w:rPr>
-          <w:b/>
-          <w:color w:val="1E3B7D"/>
-        </w:rPr>
-        <w:t xml:space="preserve">¿Cómo se implementa? </w:t>
-      </w:r>
-      <w:r>
-        <w:rPr>
-          <w:b w:val="0"/>
-        </w:rPr>
-      </w:r>
-    </w:p>
-    <w:p>
-      <w:pPr>
-        <w:pStyle w:val="ListBullet"/>
-        <w:spacing w:after="60"/>
-        <w:ind w:left="454"/>
-        <w:jc w:val="both"/>
-      </w:pPr>
-      <w:r>
-        <w:rPr>
-          <w:b w:val="0"/>
-        </w:rPr>
-        <w:t>Talleres de formación docente en metodologías de emprendimiento (Business Model Canvas, Lean Startup, design thinking).</w:t>
-      </w:r>
-    </w:p>
-    <w:p>
-      <w:pPr>
-        <w:pStyle w:val="ListBullet"/>
-        <w:spacing w:after="60"/>
-        <w:ind w:left="454"/>
-        <w:jc w:val="both"/>
-      </w:pPr>
-      <w:r>
-        <w:rPr>
-          <w:b w:val="0"/>
-        </w:rPr>
-        <w:t>Conformación de un grupo de mentores multidisciplinarios (profesores de distintas áreas) y de asesores externos (empresarios y egresados).</w:t>
-      </w:r>
-    </w:p>
-    <w:p>
-      <w:pPr>
-        <w:pStyle w:val="ListBullet"/>
-        <w:spacing w:after="60"/>
-        <w:ind w:left="454"/>
-        <w:jc w:val="both"/>
-      </w:pPr>
-      <w:r>
-        <w:rPr>
-          <w:b w:val="0"/>
-        </w:rPr>
-        <w:t>Protocolo de asignación de mentores según la etapa y el sector del proyecto.</w:t>
-      </w:r>
-    </w:p>
-    <w:p>
-      <w:pPr>
-        <w:spacing w:after="120"/>
-        <w:jc w:val="both"/>
-      </w:pPr>
-      <w:r>
-        <w:rPr>
-          <w:b/>
-          <w:color w:val="1E3B7D"/>
-        </w:rPr>
-        <w:t xml:space="preserve">Evidencia que la respalda. </w:t>
-      </w:r>
-      <w:r>
-        <w:rPr>
-          <w:b w:val="0"/>
-        </w:rPr>
-        <w:t>Los docentes priorizaron las mentorías (5 de 10) y la formación docente (4 de 10), y propusieron un grupo de profesores multidisciplinarios y asesores externos para asesorías por área (P6 y P9). Coincide con la estrategia FO del DOFA de adaptar metodologías probadas.</w:t>
-      </w:r>
-    </w:p>
-    <w:p>
-      <w:pPr>
-        <w:spacing w:after="120"/>
-        <w:jc w:val="both"/>
-      </w:pPr>
-      <w:r>
-        <w:rPr>
-          <w:b/>
-          <w:color w:val="1E3B7D"/>
-        </w:rPr>
-        <w:t xml:space="preserve">Indicador de seguimiento. </w:t>
-      </w:r>
-      <w:r>
-        <w:rPr>
-          <w:b w:val="0"/>
-        </w:rPr>
-        <w:t>Número de docentes formados y número de mentorías realizadas por período.</w:t>
+        <w:t>La última estrategia combina la capacitación de los docentes en innovación y emprendimiento con la activación de una red de mentores multidisciplinarios que asesoren los proyectos según su área, de modo que el acompañamiento alcance la profundidad que cada iniciativa requiere. Contempla talleres de formación docente en metodologías como el Business Model Canvas, el Lean Startup y el design thinking; la conformación de una red de mentores —profesores de distintas áreas— y de asesores externos, como empresarios y egresados; y un protocolo para asignar los mentores según la etapa y el sector de cada proyecto.</w:t>
       </w:r>
     </w:p>
     <w:p>
@@ -1264,7 +644,20 @@
           <w:b w:val="0"/>
           <w:i w:val="0"/>
         </w:rPr>
-        <w:t>De forma complementaria, se recomienda establecer reconocimientos e incentivos para docentes y estudiantes que participen activamente, y promover redes interdisciplinarias entre facultades, tal como sugirió una parte del profesorado (P6).</w:t>
+        <w:t>Esta estrategia recoge, una vez más, lo expresado por los docentes: entre sus prioridades ubicaron las mentorías —cinco de diez— y la formación docente —cuatro de diez—, y en las respuestas abiertas propusieron conformar un grupo de profesores multidisciplinarios y sumar asesores externos para brindar asesorías por área. Coincide, además, con la estrategia ofensiva del DOFA (Anexo 4) de adaptar metodologías ya probadas. Su avance se medirá por el número de docentes formados y de mentorías realizadas por período.</w:t>
+      </w:r>
+    </w:p>
+    <w:p>
+      <w:pPr>
+        <w:spacing w:after="120"/>
+        <w:jc w:val="both"/>
+      </w:pPr>
+      <w:r>
+        <w:rPr>
+          <w:b w:val="0"/>
+          <w:i w:val="0"/>
+        </w:rPr>
+        <w:t>De forma complementaria, conviene establecer reconocimientos e incentivos para los docentes y estudiantes que participen activamente, y promover redes interdisciplinarias entre facultades, tal como sugirió una parte del profesorado en la encuesta.</w:t>
       </w:r>
     </w:p>
     <w:p>
@@ -1731,7 +1124,7 @@
           <w:b w:val="0"/>
           <w:i w:val="0"/>
         </w:rPr>
-        <w:t>Las estrategias se implementan de manera escalonada y articulada con la ruta institucional de emprendimiento, priorizando las de menor costo y mayor impacto inmediato (estrategia DA del DOFA):</w:t>
+        <w:t>Las estrategias se implementan de manera escalonada y articulada con la ruta institucional de emprendimiento, priorizando las de menor costo y mayor impacto inmediato, en línea con la estrategia de supervivencia del análisis DOFA (Anexo 4):</w:t>
       </w:r>
     </w:p>
     <w:p>
@@ -1828,7 +1221,7 @@
           <w:b w:val="0"/>
           <w:i w:val="0"/>
         </w:rPr>
-        <w:t>La articulación entre el CIE y las facultades es el factor decisivo para que la ruta institucional de emprendimiento tenga impacto real. El diagnóstico es claro y queda confirmado al contrastar las fuentes: la falta de articulación es la principal dificultad (60 %) y el emprendimiento todavía no permea el currículo (3,30/5), a pesar del alto interés de los estudiantes (87,7 %) y del respaldo docente a la solución (4,2/5).</w:t>
+        <w:t>La articulación entre el CIE y las facultades es el factor decisivo para que la ruta institucional de emprendimiento tenga un impacto real. El diagnóstico es claro y queda confirmado al contrastar las fuentes: la falta de articulación es la principal dificultad para los docentes (60 %) y el emprendimiento todavía no permea el currículo (3,30 sobre 5), a pesar del alto interés de los estudiantes (87,7 %) y del respaldo docente a la solución (4,2 sobre 5).</w:t>
       </w:r>
     </w:p>
     <w:p>
@@ -1841,7 +1234,7 @@
           <w:b w:val="0"/>
           <w:i w:val="0"/>
         </w:rPr>
-        <w:t>Las seis estrategias propuestas —docente enlace, integración curricular, mesa de articulación, comunicación diferenciada, actividades conjuntas y formación con mentorías— responden directamente a lo que docentes y estudiantes señalaron, se apoyan en el mandato del PDI 2022-2031 y ofrecen un camino de implementación por fases, medible y sostenible. Aplicadas de forma articulada, permiten que el emprendimiento pase de ser una actividad aislada a un componente transversal de la formación en la Universidad del Atlántico.</w:t>
+        <w:t>Las seis estrategias propuestas —el docente enlace, la integración curricular, la mesa de articulación, la comunicación diferenciada, las actividades conjuntas y la formación con mentorías— responden directamente a lo que docentes y estudiantes señalaron, se apoyan en el mandato del PDI 2022-2031 y ofrecen un camino de implementación por fases, medible y sostenible. Aplicadas de forma articulada, permiten que el emprendimiento pase de ser una actividad aislada a un componente transversal de la formación en la Universidad del Atlántico.</w:t>
       </w:r>
     </w:p>
     <w:p>

</xml_diff>